<commit_message>
Fix config message leak and additional comp chart filter
</commit_message>
<xml_diff>
--- a/outputs/report.docx
+++ b/outputs/report.docx
@@ -94,17 +94,6 @@
         </w:p>
       </w:sdtContent>
     </w:sdt>
-    <w:p>
-      <w:pPr>
-        <w:pStyle w:val="SourceCode"/>
-      </w:pPr>
-      <w:r>
-        <w:rPr>
-          <w:rStyle w:val="VerbatimChar"/>
-        </w:rPr>
-        <w:t xml:space="preserve">Config loaded successfully</w:t>
-      </w:r>
-    </w:p>
     <w:bookmarkStart w:id="20" w:name="dataset-overview"/>
     <w:p>
       <w:pPr>
@@ -201,7 +190,7 @@
         <w:t xml:space="preserve"> </w:t>
       </w:r>
       <w:r>
-        <w:t xml:space="preserve">Cleaned dataset exported in four formats — .sav, .dta, .xlsx, .rds</w:t>
+        <w:t xml:space="preserve">Cleaned dataset exported in four formats - .sav, .dta, .xlsx, .rds</w:t>
       </w:r>
     </w:p>
     <w:p>
@@ -317,7 +306,7 @@
         <w:t xml:space="preserve"> </w:t>
       </w:r>
       <w:r>
-        <w:t xml:space="preserve">390 unique values found — USA alone had over 50 spelling variants</w:t>
+        <w:t xml:space="preserve">390 unique values found - USA alone had over 50 spelling variants</w:t>
       </w:r>
     </w:p>
     <w:p>
@@ -339,7 +328,7 @@
         <w:t xml:space="preserve"> </w:t>
       </w:r>
       <w:r>
-        <w:t xml:space="preserve">Range 0 to 6,000,070,000 — 136 entries below 1,000, 34 zeros</w:t>
+        <w:t xml:space="preserve">Range 0 to 6,000,070,000 - 136 entries below 1,000, 34 zeros</w:t>
       </w:r>
     </w:p>
     <w:p>
@@ -361,7 +350,7 @@
         <w:t xml:space="preserve"> </w:t>
       </w:r>
       <w:r>
-        <w:t xml:space="preserve">7,372 missing (26%) — survey wording suggests no bonus</w:t>
+        <w:t xml:space="preserve">7,372 missing (26%) - survey wording suggests no bonus</w:t>
       </w:r>
     </w:p>
     <w:p>
@@ -441,13 +430,13 @@
         <w:t xml:space="preserve">3. Cleaning Decisions</w:t>
       </w:r>
     </w:p>
-    <w:bookmarkStart w:id="27" w:name="stage-1-whitespace-removal"/>
+    <w:bookmarkStart w:id="27" w:name="stage-1---whitespace-removal"/>
     <w:p>
       <w:pPr>
         <w:pStyle w:val="Heading2"/>
       </w:pPr>
       <w:r>
-        <w:t xml:space="preserve">3.1 Stage 1: Whitespace Removal</w:t>
+        <w:t xml:space="preserve">3.1 Stage 1 - Whitespace Removal</w:t>
       </w:r>
     </w:p>
     <w:p>
@@ -459,13 +448,13 @@
       </w:r>
     </w:p>
     <w:bookmarkEnd w:id="27"/>
-    <w:bookmarkStart w:id="28" w:name="stage-2-timestamp-flagging"/>
+    <w:bookmarkStart w:id="28" w:name="stage-2---timestamp-flagging"/>
     <w:p>
       <w:pPr>
         <w:pStyle w:val="Heading2"/>
       </w:pPr>
       <w:r>
-        <w:t xml:space="preserve">3.2 Stage 2: Timestamp Flagging</w:t>
+        <w:t xml:space="preserve">3.2 Stage 2 - Timestamp Flagging</w:t>
       </w:r>
     </w:p>
     <w:p>
@@ -477,13 +466,13 @@
       </w:r>
     </w:p>
     <w:bookmarkEnd w:id="28"/>
-    <w:bookmarkStart w:id="29" w:name="stage-3-country-normalisation"/>
+    <w:bookmarkStart w:id="29" w:name="stage-3---country-normalisation"/>
     <w:p>
       <w:pPr>
         <w:pStyle w:val="Heading2"/>
       </w:pPr>
       <w:r>
-        <w:t xml:space="preserve">3.3 Stage 3: Country Normalisation</w:t>
+        <w:t xml:space="preserve">3.3 Stage 3 - Country Normalisation</w:t>
       </w:r>
     </w:p>
     <w:p>
@@ -495,13 +484,13 @@
       </w:r>
     </w:p>
     <w:bookmarkEnd w:id="29"/>
-    <w:bookmarkStart w:id="30" w:name="stage-4-salary-outlier-flagging"/>
+    <w:bookmarkStart w:id="30" w:name="stage-4---salary-outlier-flagging"/>
     <w:p>
       <w:pPr>
         <w:pStyle w:val="Heading2"/>
       </w:pPr>
       <w:r>
-        <w:t xml:space="preserve">3.4 Stage 4: Salary Outlier Flagging</w:t>
+        <w:t xml:space="preserve">3.4 Stage 4 - Salary Outlier Flagging</w:t>
       </w:r>
     </w:p>
     <w:p>
@@ -513,13 +502,13 @@
       </w:r>
     </w:p>
     <w:bookmarkEnd w:id="30"/>
-    <w:bookmarkStart w:id="31" w:name="stage-5-additional-compensation-flagging"/>
+    <w:bookmarkStart w:id="31" w:name="Xf3fb01e122a5a666b0962f44ed8d3084ec8ba09"/>
     <w:p>
       <w:pPr>
         <w:pStyle w:val="Heading2"/>
       </w:pPr>
       <w:r>
-        <w:t xml:space="preserve">3.5 Stage 5: Additional Compensation Flagging</w:t>
+        <w:t xml:space="preserve">3.5 Stage 5 - Additional Compensation Flagging</w:t>
       </w:r>
     </w:p>
     <w:p>
@@ -531,13 +520,13 @@
       </w:r>
     </w:p>
     <w:bookmarkEnd w:id="31"/>
-    <w:bookmarkStart w:id="32" w:name="stage-6-industry-normalisation"/>
+    <w:bookmarkStart w:id="32" w:name="stage-6---industry-normalisation"/>
     <w:p>
       <w:pPr>
         <w:pStyle w:val="Heading2"/>
       </w:pPr>
       <w:r>
-        <w:t xml:space="preserve">3.6 Stage 6: Industry Normalisation</w:t>
+        <w:t xml:space="preserve">3.6 Stage 6 - Industry Normalisation</w:t>
       </w:r>
     </w:p>
     <w:p>
@@ -549,13 +538,13 @@
       </w:r>
     </w:p>
     <w:bookmarkEnd w:id="32"/>
-    <w:bookmarkStart w:id="33" w:name="stage-7-job-title-flagging"/>
+    <w:bookmarkStart w:id="33" w:name="stage-7---job-title-flagging"/>
     <w:p>
       <w:pPr>
         <w:pStyle w:val="Heading2"/>
       </w:pPr>
       <w:r>
-        <w:t xml:space="preserve">3.7 Stage 7: Job Title Flagging</w:t>
+        <w:t xml:space="preserve">3.7 Stage 7 - Job Title Flagging</w:t>
       </w:r>
     </w:p>
     <w:p>
@@ -567,13 +556,13 @@
       </w:r>
     </w:p>
     <w:bookmarkEnd w:id="33"/>
-    <w:bookmarkStart w:id="34" w:name="stage-8-gender-standardisation"/>
+    <w:bookmarkStart w:id="34" w:name="stage-8---gender-standardisation"/>
     <w:p>
       <w:pPr>
         <w:pStyle w:val="Heading2"/>
       </w:pPr>
       <w:r>
-        <w:t xml:space="preserve">3.8 Stage 8: Gender Standardisation</w:t>
+        <w:t xml:space="preserve">3.8 Stage 8 - Gender Standardisation</w:t>
       </w:r>
     </w:p>
     <w:p>
@@ -585,13 +574,13 @@
       </w:r>
     </w:p>
     <w:bookmarkEnd w:id="34"/>
-    <w:bookmarkStart w:id="35" w:name="stage-9-experience-band-formatting"/>
+    <w:bookmarkStart w:id="35" w:name="stage-9---experience-band-formatting"/>
     <w:p>
       <w:pPr>
         <w:pStyle w:val="Heading2"/>
       </w:pPr>
       <w:r>
-        <w:t xml:space="preserve">3.9 Stage 9: Experience Band Formatting</w:t>
+        <w:t xml:space="preserve">3.9 Stage 9 - Experience Band Formatting</w:t>
       </w:r>
     </w:p>
     <w:p>
@@ -603,13 +592,13 @@
       </w:r>
     </w:p>
     <w:bookmarkEnd w:id="35"/>
-    <w:bookmarkStart w:id="36" w:name="stage-10-experience-logic-checks"/>
+    <w:bookmarkStart w:id="36" w:name="stage-10---experience-logic-checks"/>
     <w:p>
       <w:pPr>
         <w:pStyle w:val="Heading2"/>
       </w:pPr>
       <w:r>
-        <w:t xml:space="preserve">3.10 Stage 10: Experience Logic Checks</w:t>
+        <w:t xml:space="preserve">3.10 Stage 10 - Experience Logic Checks</w:t>
       </w:r>
     </w:p>
     <w:p>
@@ -621,13 +610,13 @@
       </w:r>
     </w:p>
     <w:bookmarkEnd w:id="36"/>
-    <w:bookmarkStart w:id="37" w:name="stage-11-city-flagging"/>
+    <w:bookmarkStart w:id="37" w:name="stage-11---city-flagging"/>
     <w:p>
       <w:pPr>
         <w:pStyle w:val="Heading2"/>
       </w:pPr>
       <w:r>
-        <w:t xml:space="preserve">3.11 Stage 11: City Flagging</w:t>
+        <w:t xml:space="preserve">3.11 Stage 11 - City Flagging</w:t>
       </w:r>
     </w:p>
     <w:p>
@@ -639,13 +628,13 @@
       </w:r>
     </w:p>
     <w:bookmarkEnd w:id="37"/>
-    <w:bookmarkStart w:id="38" w:name="stage-12-multi-state-entries"/>
+    <w:bookmarkStart w:id="38" w:name="stage-12---multi-state-entries"/>
     <w:p>
       <w:pPr>
         <w:pStyle w:val="Heading2"/>
       </w:pPr>
       <w:r>
-        <w:t xml:space="preserve">3.12 Stage 12: Multi-State Entries</w:t>
+        <w:t xml:space="preserve">3.12 Stage 12 - Multi-State Entries</w:t>
       </w:r>
     </w:p>
     <w:p>
@@ -657,13 +646,13 @@
       </w:r>
     </w:p>
     <w:bookmarkEnd w:id="38"/>
-    <w:bookmarkStart w:id="39" w:name="stage-13-currency-other-standardisation"/>
+    <w:bookmarkStart w:id="39" w:name="Xc58e626a3b1db68d458329863cb142fb726608b"/>
     <w:p>
       <w:pPr>
         <w:pStyle w:val="Heading2"/>
       </w:pPr>
       <w:r>
-        <w:t xml:space="preserve">3.13 Stage 13: Currency Other Standardisation</w:t>
+        <w:t xml:space="preserve">3.13 Stage 13 - Currency Other Standardisation</w:t>
       </w:r>
     </w:p>
     <w:p>
@@ -675,13 +664,13 @@
       </w:r>
     </w:p>
     <w:bookmarkEnd w:id="39"/>
-    <w:bookmarkStart w:id="40" w:name="stage-14-currency-country-cross-check"/>
+    <w:bookmarkStart w:id="40" w:name="stage-14---currency-country-cross-check"/>
     <w:p>
       <w:pPr>
         <w:pStyle w:val="Heading2"/>
       </w:pPr>
       <w:r>
-        <w:t xml:space="preserve">3.14 Stage 14: Currency Country Cross Check</w:t>
+        <w:t xml:space="preserve">3.14 Stage 14 - Currency Country Cross Check</w:t>
       </w:r>
     </w:p>
     <w:p>
@@ -693,13 +682,13 @@
       </w:r>
     </w:p>
     <w:bookmarkEnd w:id="40"/>
-    <w:bookmarkStart w:id="41" w:name="Xea8416390253a2f8a6a15432f25c9a1dcd47d7b"/>
+    <w:bookmarkStart w:id="41" w:name="Xe8a15f5b1c7fc4167b347009b67cdb47a929afd"/>
     <w:p>
       <w:pPr>
         <w:pStyle w:val="Heading2"/>
       </w:pPr>
       <w:r>
-        <w:t xml:space="preserve">3.15 Stages 15 and 16: Missing Education and Race</w:t>
+        <w:t xml:space="preserve">3.15 Stages 15 and 16 - Missing Education and Race</w:t>
       </w:r>
     </w:p>
     <w:p>
@@ -1121,7 +1110,7 @@
         <w:t xml:space="preserve"> </w:t>
       </w:r>
       <w:r>
-        <w:t xml:space="preserve">28215 — no rows were removed during cleaning</w:t>
+        <w:t xml:space="preserve">28215 - no rows were removed during cleaning</w:t>
       </w:r>
     </w:p>
     <w:p>
@@ -1149,6 +1138,68 @@
       </w:pPr>
       <w:r>
         <w:t xml:space="preserve">5.1 Final Missingness After Cleaning and Imputation</w:t>
+      </w:r>
+    </w:p>
+    <w:p>
+      <w:pPr>
+        <w:pStyle w:val="FirstParagraph"/>
+      </w:pPr>
+      <w:r>
+        <w:t xml:space="preserve">Several variables show high remaining missingness by design. The</w:t>
+      </w:r>
+      <w:r>
+        <w:t xml:space="preserve"> </w:t>
+      </w:r>
+      <w:r>
+        <w:rPr>
+          <w:rStyle w:val="VerbatimChar"/>
+        </w:rPr>
+        <w:t xml:space="preserve">job_title_context</w:t>
+      </w:r>
+      <w:r>
+        <w:t xml:space="preserve">,</w:t>
+      </w:r>
+      <w:r>
+        <w:t xml:space="preserve"> </w:t>
+      </w:r>
+      <w:r>
+        <w:rPr>
+          <w:rStyle w:val="VerbatimChar"/>
+        </w:rPr>
+        <w:t xml:space="preserve">income_context</w:t>
+      </w:r>
+      <w:r>
+        <w:t xml:space="preserve">, and</w:t>
+      </w:r>
+      <w:r>
+        <w:t xml:space="preserve"> </w:t>
+      </w:r>
+      <w:r>
+        <w:rPr>
+          <w:rStyle w:val="VerbatimChar"/>
+        </w:rPr>
+        <w:t xml:space="preserve">currency_other</w:t>
+      </w:r>
+      <w:r>
+        <w:t xml:space="preserve"> </w:t>
+      </w:r>
+      <w:r>
+        <w:t xml:space="preserve">columns are optional freetext fields that most respondents did not complete; this is structural missingness from the survey instrument, not a data quality failure. The</w:t>
+      </w:r>
+      <w:r>
+        <w:t xml:space="preserve"> </w:t>
+      </w:r>
+      <w:r>
+        <w:rPr>
+          <w:rStyle w:val="VerbatimChar"/>
+        </w:rPr>
+        <w:t xml:space="preserve">us_state</w:t>
+      </w:r>
+      <w:r>
+        <w:t xml:space="preserve"> </w:t>
+      </w:r>
+      <w:r>
+        <w:t xml:space="preserve">column is only applicable to US-based respondents.</w:t>
       </w:r>
     </w:p>
     <w:p>

</xml_diff>